<commit_message>
Add files in gitignore
</commit_message>
<xml_diff>
--- a/Cadrage Projet ABSA.docx
+++ b/Cadrage Projet ABSA.docx
@@ -29,8 +29,40 @@
           <w:sz w:val="24"/>
           <w:szCs w:val="24"/>
         </w:rPr>
-        <w:t>Analyse automatique d'avis clients — Aspect-Based Sentiment Analysis</w:t>
-      </w:r>
+        <w:t>Analyse automatique d'avis clients</w:t>
+      </w:r>
+      <w:r>
+        <w:rPr>
+          <w:i/>
+          <w:iCs/>
+          <w:color w:val="444444"/>
+          <w:sz w:val="24"/>
+          <w:szCs w:val="24"/>
+        </w:rPr>
+        <w:t xml:space="preserve"> de produits pour bébés</w:t>
+      </w:r>
+      <w:r>
+        <w:rPr>
+          <w:i/>
+          <w:iCs/>
+          <w:color w:val="444444"/>
+          <w:sz w:val="24"/>
+          <w:szCs w:val="24"/>
+        </w:rPr>
+        <w:t xml:space="preserve"> — Aspect-Based Sentiment </w:t>
+      </w:r>
+      <w:proofErr w:type="spellStart"/>
+      <w:r>
+        <w:rPr>
+          <w:i/>
+          <w:iCs/>
+          <w:color w:val="444444"/>
+          <w:sz w:val="24"/>
+          <w:szCs w:val="24"/>
+        </w:rPr>
+        <w:t>Analysis</w:t>
+      </w:r>
+      <w:proofErr w:type="spellEnd"/>
     </w:p>
     <w:tbl>
       <w:tblPr>
@@ -147,8 +179,18 @@
                 <w:sz w:val="20"/>
                 <w:szCs w:val="20"/>
               </w:rPr>
-              <w:t>Lionel Jospin KENNE NZANGEM &amp; Karl Sondeji</w:t>
-            </w:r>
+              <w:t xml:space="preserve">Lionel Jospin KENNE NZANGEM &amp; Karl </w:t>
+            </w:r>
+            <w:proofErr w:type="spellStart"/>
+            <w:r>
+              <w:rPr>
+                <w:color w:val="000000"/>
+                <w:sz w:val="20"/>
+                <w:szCs w:val="20"/>
+              </w:rPr>
+              <w:t>Sondeji</w:t>
+            </w:r>
+            <w:proofErr w:type="spellEnd"/>
           </w:p>
         </w:tc>
       </w:tr>
@@ -244,6 +286,7 @@
                 <w:lang w:val="en-US"/>
               </w:rPr>
             </w:pPr>
+            <w:proofErr w:type="spellStart"/>
             <w:r>
               <w:rPr>
                 <w:color w:val="000000"/>
@@ -251,7 +294,17 @@
                 <w:szCs w:val="20"/>
                 <w:lang w:val="en-US"/>
               </w:rPr>
-              <w:t>aivancity School of AI &amp; Data</w:t>
+              <w:t>aivancity</w:t>
+            </w:r>
+            <w:proofErr w:type="spellEnd"/>
+            <w:r>
+              <w:rPr>
+                <w:color w:val="000000"/>
+                <w:sz w:val="20"/>
+                <w:szCs w:val="20"/>
+                <w:lang w:val="en-US"/>
+              </w:rPr>
+              <w:t xml:space="preserve"> School of AI &amp; Data</w:t>
             </w:r>
           </w:p>
         </w:tc>
@@ -297,8 +350,18 @@
                 <w:sz w:val="20"/>
                 <w:szCs w:val="20"/>
               </w:rPr>
-              <w:t>Souheil Hanoune</w:t>
-            </w:r>
+              <w:t xml:space="preserve">Souheil </w:t>
+            </w:r>
+            <w:proofErr w:type="spellStart"/>
+            <w:r>
+              <w:rPr>
+                <w:color w:val="000000"/>
+                <w:sz w:val="20"/>
+                <w:szCs w:val="20"/>
+              </w:rPr>
+              <w:t>Hanoune</w:t>
+            </w:r>
+            <w:proofErr w:type="spellEnd"/>
           </w:p>
         </w:tc>
       </w:tr>
@@ -343,7 +406,25 @@
                 <w:sz w:val="20"/>
                 <w:szCs w:val="20"/>
               </w:rPr>
-              <w:t>Advanced Practical Machine Learning</w:t>
+              <w:t xml:space="preserve">Advanced </w:t>
+            </w:r>
+            <w:proofErr w:type="spellStart"/>
+            <w:r>
+              <w:rPr>
+                <w:color w:val="000000"/>
+                <w:sz w:val="20"/>
+                <w:szCs w:val="20"/>
+              </w:rPr>
+              <w:t>Practical</w:t>
+            </w:r>
+            <w:proofErr w:type="spellEnd"/>
+            <w:r>
+              <w:rPr>
+                <w:color w:val="000000"/>
+                <w:sz w:val="20"/>
+                <w:szCs w:val="20"/>
+              </w:rPr>
+              <w:t xml:space="preserve"> Machine Learning</w:t>
             </w:r>
           </w:p>
         </w:tc>
@@ -454,7 +535,23 @@
         <w:spacing w:after="120"/>
       </w:pPr>
       <w:r>
-        <w:t>Concevoir et livrer un système de Deep Learning (PyTorch) capable d'analyser des avis clients au-delà du sentiment global : détection d'aspects (produit, prix, service, livraison, etc.) et sentiment associé à chaque aspect, avec une démonstration Streamlit fonctionnelle.</w:t>
+        <w:t>Concevoir et livrer un système de Deep Learning (</w:t>
+      </w:r>
+      <w:proofErr w:type="spellStart"/>
+      <w:r>
+        <w:t>PyTorch</w:t>
+      </w:r>
+      <w:proofErr w:type="spellEnd"/>
+      <w:r>
+        <w:t xml:space="preserve">) capable d'analyser des avis clients au-delà du sentiment global : détection d'aspects (produit, prix, service, livraison, etc.) et sentiment associé à chaque aspect, avec une démonstration </w:t>
+      </w:r>
+      <w:proofErr w:type="spellStart"/>
+      <w:r>
+        <w:t>Streamlit</w:t>
+      </w:r>
+      <w:proofErr w:type="spellEnd"/>
+      <w:r>
+        <w:t xml:space="preserve"> fonctionnelle.</w:t>
       </w:r>
     </w:p>
     <w:p>
@@ -483,7 +580,15 @@
         <w:spacing w:after="60"/>
       </w:pPr>
       <w:r>
-        <w:t>Aspect-Based Sentiment Analysis (ABSA)</w:t>
+        <w:t xml:space="preserve">Aspect-Based Sentiment </w:t>
+      </w:r>
+      <w:proofErr w:type="spellStart"/>
+      <w:r>
+        <w:t>Analysis</w:t>
+      </w:r>
+      <w:proofErr w:type="spellEnd"/>
+      <w:r>
+        <w:t xml:space="preserve"> (ABSA)</w:t>
       </w:r>
     </w:p>
     <w:p>
@@ -496,7 +601,15 @@
         <w:spacing w:after="60"/>
       </w:pPr>
       <w:r>
-        <w:t>Modèle de référence (baseline) LSTM ou Bi-LSTM</w:t>
+        <w:t>Modèle de référence (</w:t>
+      </w:r>
+      <w:proofErr w:type="spellStart"/>
+      <w:r>
+        <w:t>baseline</w:t>
+      </w:r>
+      <w:proofErr w:type="spellEnd"/>
+      <w:r>
+        <w:t>) LSTM ou Bi-LSTM</w:t>
       </w:r>
     </w:p>
     <w:p>
@@ -522,7 +635,31 @@
         <w:spacing w:after="60"/>
       </w:pPr>
       <w:r>
-        <w:t>Comparaison quantitative des approches (Accuracy, Precision, Recall, F1-score)</w:t>
+        <w:t>Comparaison quantitative des approches (</w:t>
+      </w:r>
+      <w:proofErr w:type="spellStart"/>
+      <w:r>
+        <w:t>Accuracy</w:t>
+      </w:r>
+      <w:proofErr w:type="spellEnd"/>
+      <w:r>
+        <w:t xml:space="preserve">, </w:t>
+      </w:r>
+      <w:proofErr w:type="spellStart"/>
+      <w:r>
+        <w:t>Precision</w:t>
+      </w:r>
+      <w:proofErr w:type="spellEnd"/>
+      <w:r>
+        <w:t xml:space="preserve">, </w:t>
+      </w:r>
+      <w:proofErr w:type="spellStart"/>
+      <w:r>
+        <w:t>Recall</w:t>
+      </w:r>
+      <w:proofErr w:type="spellEnd"/>
+      <w:r>
+        <w:t>, F1-score)</w:t>
       </w:r>
     </w:p>
     <w:p>
@@ -535,8 +672,13 @@
         <w:spacing w:after="60"/>
       </w:pPr>
       <w:r>
-        <w:t>Démonstration interactive Streamlit</w:t>
-      </w:r>
+        <w:t xml:space="preserve">Démonstration interactive </w:t>
+      </w:r>
+      <w:proofErr w:type="spellStart"/>
+      <w:r>
+        <w:t>Streamlit</w:t>
+      </w:r>
+      <w:proofErr w:type="spellEnd"/>
     </w:p>
     <w:p>
       <w:pPr>
@@ -582,7 +724,15 @@
         <w:spacing w:after="60"/>
       </w:pPr>
       <w:r>
-        <w:t>Tout dataset pré-empaqueté de tutoriel ou banni (MNIST, Iris, Titanic, etc.)</w:t>
+        <w:t xml:space="preserve">Tout </w:t>
+      </w:r>
+      <w:proofErr w:type="spellStart"/>
+      <w:r>
+        <w:t>dataset</w:t>
+      </w:r>
+      <w:proofErr w:type="spellEnd"/>
+      <w:r>
+        <w:t xml:space="preserve"> pré-empaqueté de tutoriel ou banni (MNIST, Iris, Titanic, etc.)</w:t>
       </w:r>
     </w:p>
     <w:p>
@@ -595,7 +745,23 @@
         <w:spacing w:after="60"/>
       </w:pPr>
       <w:r>
-        <w:t>Tout modèle non-Deep Learning comme modèle principal (Random Forest, XGBoost, scikit-learn...)</w:t>
+        <w:t xml:space="preserve">Tout modèle non-Deep Learning comme modèle principal (Random Forest, </w:t>
+      </w:r>
+      <w:proofErr w:type="spellStart"/>
+      <w:r>
+        <w:t>XGBoost</w:t>
+      </w:r>
+      <w:proofErr w:type="spellEnd"/>
+      <w:r>
+        <w:t xml:space="preserve">, </w:t>
+      </w:r>
+      <w:proofErr w:type="spellStart"/>
+      <w:r>
+        <w:t>scikit-learn</w:t>
+      </w:r>
+      <w:proofErr w:type="spellEnd"/>
+      <w:r>
+        <w:t>...)</w:t>
       </w:r>
     </w:p>
     <w:p>
@@ -768,8 +934,18 @@
                 <w:sz w:val="20"/>
                 <w:szCs w:val="20"/>
               </w:rPr>
-              <w:t>Code source, modèle entraîné, application Streamlit</w:t>
-            </w:r>
+              <w:t xml:space="preserve">Code source, modèle entraîné, application </w:t>
+            </w:r>
+            <w:proofErr w:type="spellStart"/>
+            <w:r>
+              <w:rPr>
+                <w:color w:val="000000"/>
+                <w:sz w:val="20"/>
+                <w:szCs w:val="20"/>
+              </w:rPr>
+              <w:t>Streamlit</w:t>
+            </w:r>
+            <w:proofErr w:type="spellEnd"/>
           </w:p>
         </w:tc>
       </w:tr>
@@ -941,8 +1117,13 @@
         </w:numPr>
         <w:spacing w:after="60"/>
       </w:pPr>
-      <w:r>
-        <w:t>PyTorch obligatoire ; boucle d'entraînement écrite et comprise par les deux membres</w:t>
+      <w:proofErr w:type="spellStart"/>
+      <w:r>
+        <w:t>PyTorch</w:t>
+      </w:r>
+      <w:proofErr w:type="spellEnd"/>
+      <w:r>
+        <w:t xml:space="preserve"> obligatoire ; boucle d'entraînement écrite et comprise par les deux membres</w:t>
       </w:r>
     </w:p>
     <w:p>
@@ -954,8 +1135,13 @@
         </w:numPr>
         <w:spacing w:after="60"/>
       </w:pPr>
-      <w:r>
-        <w:t>Datasets et approches bannis à éviter strictement (cf. règlement officiel du cours)</w:t>
+      <w:proofErr w:type="spellStart"/>
+      <w:r>
+        <w:t>Datasets</w:t>
+      </w:r>
+      <w:proofErr w:type="spellEnd"/>
+      <w:r>
+        <w:t xml:space="preserve"> et approches bannis à éviter strictement (cf. règlement officiel du cours)</w:t>
       </w:r>
     </w:p>
     <w:p>
@@ -968,7 +1154,15 @@
         <w:spacing w:after="60"/>
       </w:pPr>
       <w:r>
-        <w:t>Application Streamlit interactive requise (entrée utilisateur → prédiction visible)</w:t>
+        <w:t xml:space="preserve">Application </w:t>
+      </w:r>
+      <w:proofErr w:type="spellStart"/>
+      <w:r>
+        <w:t>Streamlit</w:t>
+      </w:r>
+      <w:proofErr w:type="spellEnd"/>
+      <w:r>
+        <w:t xml:space="preserve"> interactive requise (entrée utilisateur → prédiction visible)</w:t>
       </w:r>
     </w:p>
     <w:p>
@@ -1123,13 +1317,41 @@
             </w:tcMar>
           </w:tcPr>
           <w:p>
-            <w:r>
-              <w:rPr>
-                <w:color w:val="000000"/>
-                <w:sz w:val="20"/>
-                <w:szCs w:val="20"/>
-              </w:rPr>
-              <w:t>Dataset ABSA choisi (SemEval / Amazon / Yelp) sans annotations natives par aspect</w:t>
+            <w:proofErr w:type="spellStart"/>
+            <w:r>
+              <w:rPr>
+                <w:color w:val="000000"/>
+                <w:sz w:val="20"/>
+                <w:szCs w:val="20"/>
+              </w:rPr>
+              <w:t>Dataset</w:t>
+            </w:r>
+            <w:proofErr w:type="spellEnd"/>
+            <w:r>
+              <w:rPr>
+                <w:color w:val="000000"/>
+                <w:sz w:val="20"/>
+                <w:szCs w:val="20"/>
+              </w:rPr>
+              <w:t xml:space="preserve"> ABSA choisi (</w:t>
+            </w:r>
+            <w:proofErr w:type="spellStart"/>
+            <w:r>
+              <w:rPr>
+                <w:color w:val="000000"/>
+                <w:sz w:val="20"/>
+                <w:szCs w:val="20"/>
+              </w:rPr>
+              <w:t>SemEval</w:t>
+            </w:r>
+            <w:proofErr w:type="spellEnd"/>
+            <w:r>
+              <w:rPr>
+                <w:color w:val="000000"/>
+                <w:sz w:val="20"/>
+                <w:szCs w:val="20"/>
+              </w:rPr>
+              <w:t xml:space="preserve"> / Amazon / Yelp) sans annotations natives par aspect</w:t>
             </w:r>
           </w:p>
         </w:tc>
@@ -1173,8 +1395,36 @@
                 <w:sz w:val="20"/>
                 <w:szCs w:val="20"/>
               </w:rPr>
-              <w:t>Valider dès la semaine 1 que le dataset a bien des labels aspect-level</w:t>
-            </w:r>
+              <w:t xml:space="preserve">Valider dès la semaine 1 que le </w:t>
+            </w:r>
+            <w:proofErr w:type="spellStart"/>
+            <w:r>
+              <w:rPr>
+                <w:color w:val="000000"/>
+                <w:sz w:val="20"/>
+                <w:szCs w:val="20"/>
+              </w:rPr>
+              <w:t>dataset</w:t>
+            </w:r>
+            <w:proofErr w:type="spellEnd"/>
+            <w:r>
+              <w:rPr>
+                <w:color w:val="000000"/>
+                <w:sz w:val="20"/>
+                <w:szCs w:val="20"/>
+              </w:rPr>
+              <w:t xml:space="preserve"> a bien des labels aspect-</w:t>
+            </w:r>
+            <w:proofErr w:type="spellStart"/>
+            <w:r>
+              <w:rPr>
+                <w:color w:val="000000"/>
+                <w:sz w:val="20"/>
+                <w:szCs w:val="20"/>
+              </w:rPr>
+              <w:t>level</w:t>
+            </w:r>
+            <w:proofErr w:type="spellEnd"/>
             <w:r>
               <w:rPr>
                 <w:color w:val="000000"/>
@@ -1257,7 +1507,25 @@
                 <w:sz w:val="20"/>
                 <w:szCs w:val="20"/>
               </w:rPr>
-              <w:t>Prototyper rapidement sur un sous-échantillon avant de scaler à l'ensemble des données</w:t>
+              <w:t xml:space="preserve">Prototyper rapidement sur un sous-échantillon avant de </w:t>
+            </w:r>
+            <w:proofErr w:type="spellStart"/>
+            <w:r>
+              <w:rPr>
+                <w:color w:val="000000"/>
+                <w:sz w:val="20"/>
+                <w:szCs w:val="20"/>
+              </w:rPr>
+              <w:t>scaler</w:t>
+            </w:r>
+            <w:proofErr w:type="spellEnd"/>
+            <w:r>
+              <w:rPr>
+                <w:color w:val="000000"/>
+                <w:sz w:val="20"/>
+                <w:szCs w:val="20"/>
+              </w:rPr>
+              <w:t xml:space="preserve"> à l'ensemble des données</w:t>
             </w:r>
           </w:p>
         </w:tc>
@@ -1509,7 +1777,25 @@
                 <w:sz w:val="20"/>
                 <w:szCs w:val="20"/>
               </w:rPr>
-              <w:t>Problème intéressant, dataset réel, pas une copie de tutoriel</w:t>
+              <w:t xml:space="preserve">Problème intéressant, </w:t>
+            </w:r>
+            <w:proofErr w:type="spellStart"/>
+            <w:r>
+              <w:rPr>
+                <w:color w:val="000000"/>
+                <w:sz w:val="20"/>
+                <w:szCs w:val="20"/>
+              </w:rPr>
+              <w:t>dataset</w:t>
+            </w:r>
+            <w:proofErr w:type="spellEnd"/>
+            <w:r>
+              <w:rPr>
+                <w:color w:val="000000"/>
+                <w:sz w:val="20"/>
+                <w:szCs w:val="20"/>
+              </w:rPr>
+              <w:t xml:space="preserve"> réel, pas une copie de tutoriel</w:t>
             </w:r>
           </w:p>
         </w:tc>
@@ -1645,8 +1931,18 @@
                 <w:sz w:val="20"/>
                 <w:szCs w:val="20"/>
               </w:rPr>
-              <w:t>Code propre, boucle d'entraînement correcte, usage correct de PyTorch</w:t>
-            </w:r>
+              <w:t xml:space="preserve">Code propre, boucle d'entraînement correcte, usage correct de </w:t>
+            </w:r>
+            <w:proofErr w:type="spellStart"/>
+            <w:r>
+              <w:rPr>
+                <w:color w:val="000000"/>
+                <w:sz w:val="20"/>
+                <w:szCs w:val="20"/>
+              </w:rPr>
+              <w:t>PyTorch</w:t>
+            </w:r>
+            <w:proofErr w:type="spellEnd"/>
           </w:p>
         </w:tc>
       </w:tr>
@@ -1713,7 +2009,25 @@
                 <w:sz w:val="20"/>
                 <w:szCs w:val="20"/>
               </w:rPr>
-              <w:t>Application Streamlit qui fonctionne et permet l'interaction</w:t>
+              <w:t xml:space="preserve">Application </w:t>
+            </w:r>
+            <w:proofErr w:type="spellStart"/>
+            <w:r>
+              <w:rPr>
+                <w:color w:val="000000"/>
+                <w:sz w:val="20"/>
+                <w:szCs w:val="20"/>
+              </w:rPr>
+              <w:t>Streamlit</w:t>
+            </w:r>
+            <w:proofErr w:type="spellEnd"/>
+            <w:r>
+              <w:rPr>
+                <w:color w:val="000000"/>
+                <w:sz w:val="20"/>
+                <w:szCs w:val="20"/>
+              </w:rPr>
+              <w:t xml:space="preserve"> qui fonctionne et permet l'interaction</w:t>
             </w:r>
           </w:p>
         </w:tc>

</xml_diff>